<commit_message>
Marcius Melhem: revisão da Parte 3
Co-Authored-By: Claude Opus 5.5 <noreply@anthropic.com>
Claude-Session: https://claude.ai/code/session_01MJjUEEZrxQDEUifKK2vj9g
</commit_message>
<xml_diff>
--- a/roteiros/marcius-melhem/Melhem_Parte3.docx
+++ b/roteiros/marcius-melhem/Melhem_Parte3.docx
@@ -31,7 +31,7 @@
         <w:rPr>
           <w:color w:val="000000"/>
         </w:rPr>
-        <w:t>O repórter João Batista Júnior tinha passado meses ouvindo gente. Atores, roteiristas, pessoas da produção, gente que trabalhou anos dentro do departamento de humor da Globo. Quarenta e três pessoas, ao todo.</w:t>
+        <w:t>O repórter João Batista Júnior tinha ouvido muita gente. Atores, roteiristas, pessoas da produção, gente que trabalhou anos dentro do departamento de humor da Globo. Quarenta e três pessoas, ao todo.</w:t>
       </w:r>
     </w:p>
     <w:p>
@@ -39,7 +39,7 @@
         <w:rPr>
           <w:color w:val="000000"/>
         </w:rPr>
-        <w:t>A piauí é conhecida por textos longos, cheios de detalhes, com cada informação checada mais de uma vez. Por isso, quando uma reportagem dessas sai, ela não passa despercebida.</w:t>
+        <w:t>A piauí é conhecida por textos longos e cheios de detalhes. Por isso, quando uma reportagem dessas sai, ela não passa despercebida.</w:t>
       </w:r>
     </w:p>
     <w:p>
@@ -63,7 +63,7 @@
         <w:rPr>
           <w:color w:val="000000"/>
         </w:rPr>
-        <w:t>A Globo também foi procurada pela revista. Um executivo da emissora disse que a empresa estava estudando a melhor forma de dar retorno às pessoas que tinham denunciado.</w:t>
+        <w:t>A Globo também foi procurada pela revista. Um executivo da emissora disse que a empresa estava estudando a melhor forma de dar um retorno sobre o caso.</w:t>
       </w:r>
     </w:p>
     <w:p>
@@ -111,7 +111,7 @@
         <w:rPr>
           <w:color w:val="000000"/>
         </w:rPr>
-        <w:t>Para Melhem, ele estava sendo julgado em praça pública, antes de qualquer processo.</w:t>
+        <w:t>Para Melhem, ele estava sendo julgado em praça pública, antes de qualquer processo, sem chance real de se defender.</w:t>
       </w:r>
     </w:p>
     <w:p>
@@ -167,7 +167,15 @@
         <w:rPr>
           <w:color w:val="000000"/>
         </w:rPr>
-        <w:t>Ele também levantou uma suspeita. Sugeriu que as acusações tinham a ver com uma briga profissional, uma disputa em torno de um programa em dois mil e dezenove.</w:t>
+        <w:t>Mas, quando o assunto foi o que exatamente aconteceu entre os dois naquela noite, ele parou. Disse que sobre aquilo só falaria na Justiça.</w:t>
+      </w:r>
+    </w:p>
+    <w:p>
+      <w:r>
+        <w:rPr>
+          <w:color w:val="000000"/>
+        </w:rPr>
+        <w:t>Ele também levantou uma suspeita grave. Sugeriu que as acusações tinham a ver com uma briga profissional, uma disputa em torno de um programa em dois mil e dezenove.</w:t>
       </w:r>
     </w:p>
     <w:p>
@@ -223,7 +231,7 @@
         <w:rPr>
           <w:color w:val="000000"/>
         </w:rPr>
-        <w:t>Essa é a versão dele. Ele sempre negou as acusações, e nunca foi condenado por nenhuma delas.</w:t>
+        <w:t>Essa é a versão dele, contada por ele mesmo em rede nacional. Ele sempre negou as acusações, e nunca foi condenado por nenhuma delas.</w:t>
       </w:r>
     </w:p>
     <w:p>
@@ -239,15 +247,7 @@
         <w:rPr>
           <w:color w:val="000000"/>
         </w:rPr>
-        <w:t>Esse relato foi reconstruído a partir de pessoas que estavam na festa. Gente que viu Dani logo depois daquela noite e contou à revista o que presenciou. Cada detalhe que você vai ouvir é atribuído à reportagem, e todos foram negados por Melhem.</w:t>
-      </w:r>
-    </w:p>
-    <w:p>
-      <w:r>
-        <w:rPr>
-          <w:color w:val="000000"/>
-        </w:rPr>
-        <w:t>É esse relato que a gente vai ouvir agora. A partir daqui, tudo o que você vai ouvir é o que a revista publicou naquele dezembro de dois mil e vinte, com base no que as testemunhas contaram ao repórter.</w:t>
+        <w:t>Esse relato foi reconstruído a partir de pessoas que estavam na festa. Gente que viu Dani logo depois daquela noite e contou à revista o que presenciou. Cada detalhe que você vai ouvir agora é atribuído à reportagem publicada naquele dezembro de dois mil e vinte, e todos foram negados por Melhem.</w:t>
       </w:r>
     </w:p>
     <w:p>
@@ -311,7 +311,7 @@
         <w:rPr>
           <w:color w:val="1F4EB4"/>
         </w:rPr>
-        <w:t>Pense na cena. Uma festa cheia de colegas de trabalho, com música e conversa alta. A poucos metros dali, uma mulher saindo de perto da porta de um banheiro, abalada, sem saber o que fazer.</w:t>
+        <w:t>Pense na cena. Uma festa cheia de colegas de trabalho. A poucos metros de todos eles, uma mulher saindo de perto da porta de um banheiro, abalada, sem saber o que fazer.</w:t>
       </w:r>
     </w:p>
     <w:p>
@@ -351,7 +351,7 @@
         <w:rPr>
           <w:color w:val="1F4EB4"/>
         </w:rPr>
-        <w:t>A reportagem descreve que, depois disso, a humorista passou a temer pela própria carreira. A reportagem fala em ameaças de boicote profissional.</w:t>
+        <w:t>A reportagem também fala em ameaças de boicote profissional contra ela.</w:t>
       </w:r>
     </w:p>
     <w:p>
@@ -415,7 +415,7 @@
         <w:rPr>
           <w:color w:val="1F4EB4"/>
         </w:rPr>
-        <w:t>Sem advertência. Sem afastamento naquele momento.</w:t>
+        <w:t>Sem nenhuma advertência.</w:t>
       </w:r>
     </w:p>
     <w:p>
@@ -447,7 +447,7 @@
         <w:rPr>
           <w:color w:val="000000"/>
         </w:rPr>
-        <w:t>Segundo a reportagem, as três atrizes relataram desconforto em trabalhar com Melhem. Uma delas descreveu contatos de teor sexual que não tinha desejado, durante gravações.</w:t>
+        <w:t>Segundo a reportagem, as três atrizes relataram desconforto em trabalhar com Melhem. E descreveram contatos de teor sexual que não tinham desejado, durante cenas e gravações.</w:t>
       </w:r>
     </w:p>
     <w:p>
@@ -456,14 +456,6 @@
           <w:color w:val="000000"/>
         </w:rPr>
         <w:t>A revista também falava em mensagens de conteúdo sexual enviadas repetidamente a mulheres da equipe.</w:t>
-      </w:r>
-    </w:p>
-    <w:p>
-      <w:r>
-        <w:rPr>
-          <w:color w:val="000000"/>
-        </w:rPr>
-        <w:t>A reportagem citava os colegas que tinham cobrado uma atitude da Globo. Marcelo Adnet, o ex-marido de Dani, estava entre eles.</w:t>
       </w:r>
     </w:p>
     <w:p>
@@ -487,7 +479,7 @@
         <w:rPr>
           <w:color w:val="000000"/>
         </w:rPr>
-        <w:t>Enquanto isso, a Polícia Civil do Rio de Janeiro investigava o caso. O inquérito ia crescendo. Depoimentos, mensagens, documentos.</w:t>
+        <w:t>Enquanto isso, o caso já estava sendo investigado pelas autoridades do Rio de Janeiro. O inquérito ia crescendo, com depoimentos e documentos.</w:t>
       </w:r>
     </w:p>
     <w:p>
@@ -495,7 +487,7 @@
         <w:rPr>
           <w:color w:val="000000"/>
         </w:rPr>
-        <w:t>Lembra das duas mil e quatrocentas páginas?</w:t>
+        <w:t>Lembre das duas mil e quatrocentas páginas.</w:t>
       </w:r>
     </w:p>
     <w:p>

</xml_diff>

<commit_message>
Marcius Melhem: Parte 3
Co-Authored-By: Claude Opus 5.5 <noreply@anthropic.com>
Claude-Session: https://claude.ai/code/session_01MJjUEEZrxQDEUifKK2vj9g
</commit_message>
<xml_diff>
--- a/roteiros/marcius-melhem/Melhem_Parte3.docx
+++ b/roteiros/marcius-melhem/Melhem_Parte3.docx
@@ -7,7 +7,7 @@
         <w:pStyle w:val="Heading1"/>
       </w:pPr>
       <w:r>
-        <w:t>Assim FOI a VIDA de MARCIUS MELHEM: O Escândalo Que A Globo Não Conseguiu Abafar — Parte 3</w:t>
+        <w:t>MARCIUS MELHEM: O Escândalo Que a Globo Nunca Explicou — Parte 3</w:t>
       </w:r>
     </w:p>
     <w:p>
@@ -15,7 +15,7 @@
         <w:rPr>
           <w:color w:val="000000"/>
         </w:rPr>
-        <w:t>Sexta-feira, quatro de dezembro de dois mil e vinte.</w:t>
+        <w:t>Para entender o que estava escondido atrás daquele comunicado, é preciso voltar alguns meses no tempo.</w:t>
       </w:r>
     </w:p>
     <w:p>
@@ -23,7 +23,7 @@
         <w:rPr>
           <w:color w:val="000000"/>
         </w:rPr>
-        <w:t>A revista piauí publicou a reportagem.</w:t>
+        <w:t>Dois mil e dezenove.</w:t>
       </w:r>
     </w:p>
     <w:p>
@@ -31,7 +31,7 @@
         <w:rPr>
           <w:color w:val="000000"/>
         </w:rPr>
-        <w:t>O repórter João Batista Júnior tinha ouvido muita gente. Atores, roteiristas, pessoas da produção, gente que trabalhou anos dentro do departamento de humor da Globo. Quarenta e três pessoas, ao todo.</w:t>
+        <w:t>Marcius Melhem estava no auge. Chefe de toda a área de humor da maior emissora do país.</w:t>
       </w:r>
     </w:p>
     <w:p>
@@ -39,7 +39,7 @@
         <w:rPr>
           <w:color w:val="000000"/>
         </w:rPr>
-        <w:t>A piauí é conhecida por textos longos e cheios de detalhes. Por isso, quando uma reportagem dessas sai, ela não passa despercebida.</w:t>
+        <w:t>Enquanto isso, uma das humoristas do elenco carregava uma decisão que vinha adiando havia muito tempo.</w:t>
       </w:r>
     </w:p>
     <w:p>
@@ -47,7 +47,7 @@
         <w:rPr>
           <w:color w:val="000000"/>
         </w:rPr>
-        <w:t>Aquela não passou.</w:t>
+        <w:t>Dani Calabresa.</w:t>
       </w:r>
     </w:p>
     <w:p>
@@ -55,7 +55,7 @@
         <w:rPr>
           <w:color w:val="000000"/>
         </w:rPr>
-        <w:t>Em poucas horas, o nome de Marcius Melhem estava em todos os sites do país. Pela primeira vez, o público conheceu a história que as duas notas da Globo tinham deixado de fora.</w:t>
+        <w:t>Ela não tinha chegado à Globo por acaso. Antes, já era conhecida do público jovem pela MTV, onde fez humor durante anos. Depois, passou pelo CQC, na Band, um dos programas mais comentados da época.</w:t>
       </w:r>
     </w:p>
     <w:p>
@@ -63,7 +63,7 @@
         <w:rPr>
           <w:color w:val="000000"/>
         </w:rPr>
-        <w:t>A Globo também foi procurada pela revista. Um executivo da emissora disse que a empresa estava estudando a melhor forma de dar um retorno sobre o caso.</w:t>
+        <w:t>Quando a Globo decidiu renovar o humor da casa, o convite veio. Dani contou em entrevistas que já tinha recebido propostas antes, mas que só aceitou quando apareceu um projeto que a animou de verdade. O novo Zorra.</w:t>
       </w:r>
     </w:p>
     <w:p>
@@ -71,7 +71,87 @@
         <w:rPr>
           <w:color w:val="000000"/>
         </w:rPr>
-        <w:t>Para quem tinha feito aquela ligação um ano antes, a resposta chegava tarde.</w:t>
+        <w:t>O programa comandado por Marcius Melhem.</w:t>
+      </w:r>
+    </w:p>
+    <w:p>
+      <w:r>
+        <w:rPr>
+          <w:color w:val="000000"/>
+        </w:rPr>
+        <w:t>Naquele ano, ela tinha passado uma temporada fora, nos Estados Unidos. E, segundo o que foi publicado depois, decidiu procurar a direção da Globo para relatar episódios que, de acordo com ela, tinham acontecido nos anos em que trabalhava sob o comando de Melhem.</w:t>
+      </w:r>
+    </w:p>
+    <w:p>
+      <w:r>
+        <w:rPr>
+          <w:color w:val="000000"/>
+        </w:rPr>
+        <w:t>Pense no peso daquele passo.</w:t>
+      </w:r>
+    </w:p>
+    <w:p>
+      <w:r>
+        <w:rPr>
+          <w:color w:val="000000"/>
+        </w:rPr>
+        <w:t>Ela ia fazer uma queixa contra o chefe de todo o departamento onde trabalhava. Contra o homem que decidia se o trabalho dela ia ao ar.</w:t>
+      </w:r>
+    </w:p>
+    <w:p>
+      <w:r>
+        <w:rPr>
+          <w:color w:val="000000"/>
+        </w:rPr>
+        <w:t>Em qualquer empresa, uma queixa contra o chefe já é uma decisão arriscada. Na televisão, onde um papel pode desaparecer de uma temporada para a outra sem nenhuma explicação, o risco é ainda maior. Quem reclama pode simplesmente deixar de ser chamado.</w:t>
+      </w:r>
+    </w:p>
+    <w:p>
+      <w:r>
+        <w:rPr>
+          <w:color w:val="000000"/>
+        </w:rPr>
+        <w:t>Segundo relatos publicados depois, era exatamente esse medo que fazia muita gente ficar em silêncio dentro daquele departamento.</w:t>
+      </w:r>
+    </w:p>
+    <w:p>
+      <w:r>
+        <w:rPr>
+          <w:color w:val="000000"/>
+        </w:rPr>
+        <w:t>Segundo a reportagem, a primeira pessoa a ouvir o relato foi Monica Albuquerque, uma das diretoras da área artística da emissora.</w:t>
+      </w:r>
+    </w:p>
+    <w:p>
+      <w:r>
+        <w:rPr>
+          <w:color w:val="000000"/>
+        </w:rPr>
+        <w:t>A resposta, de acordo com a mesma reportagem, ficou muito longe do que Dani esperava.</w:t>
+      </w:r>
+    </w:p>
+    <w:p>
+      <w:r>
+        <w:rPr>
+          <w:color w:val="000000"/>
+        </w:rPr>
+        <w:t>A recomendação teria sido que Melhem fizesse terapia.</w:t>
+      </w:r>
+    </w:p>
+    <w:p>
+      <w:r>
+        <w:rPr>
+          <w:color w:val="000000"/>
+        </w:rPr>
+        <w:t>Ele seguiu no cargo, sem nenhuma punição.</w:t>
+      </w:r>
+    </w:p>
+    <w:p>
+      <w:r>
+        <w:rPr>
+          <w:color w:val="000000"/>
+        </w:rPr>
+        <w:t>O diretor continuou decidindo quem entrava no ar. E a humorista que tinha reclamado dele continuava no mesmo departamento.</w:t>
       </w:r>
     </w:p>
     <w:p>
@@ -79,7 +159,7 @@
         <w:rPr>
           <w:color w:val="C00000"/>
         </w:rPr>
-        <w:t>E o que a revista contou sobre aquela ligação, e sobre o que a Globo fez logo depois dela, ia deixar muita gente revoltada. Mas, antes de chegar lá, o país ia ouvir a voz do próprio acusado.</w:t>
+        <w:t>Guarde esse detalhe. Uma queixa contra o homem mais poderoso do humor da Globo, e a primeira resposta, segundo a reportagem, foi uma sugestão de terapia. Só que essa decisão ia voltar para assombrar a emissora meses depois. E muita gente ia querer saber quem mais sabia daquilo, e por que ficou calado.</w:t>
       </w:r>
     </w:p>
     <w:p>
@@ -87,7 +167,7 @@
         <w:rPr>
           <w:color w:val="000000"/>
         </w:rPr>
-        <w:t>Imagine abrir aquela revista sendo uma das mulheres ouvidas. Ver, impresso, num texto lido pelo país inteiro, aquilo que você guardou durante anos. E saber que o homem de quem você está falando vai ler a mesma página no mesmo dia.</w:t>
+        <w:t>Dani não desistiu.</w:t>
       </w:r>
     </w:p>
     <w:p>
@@ -95,7 +175,7 @@
         <w:rPr>
           <w:color w:val="000000"/>
         </w:rPr>
-        <w:t>Antes de ouvir o que a reportagem contou, é justo conhecer a versão de Marcius Melhem.</w:t>
+        <w:t>Segundo os relatos publicados depois, ela levou o caso mais para cima.</w:t>
       </w:r>
     </w:p>
     <w:p>
@@ -103,7 +183,7 @@
         <w:rPr>
           <w:color w:val="000000"/>
         </w:rPr>
-        <w:t>A piauí procurou o humorista. Ele não quis dar entrevista. Disse que a sentença contra ele já tinha sido dada. Segundo a revista, chegou a dizer que estava disposto a pedir desculpas a quem tivesse se sentido ofendida, desde que tudo fosse tratado com transparência. E mandou uma nota afirmando que ia buscar justiça.</w:t>
+        <w:t>Até Carlos Henrique Schroeder.</w:t>
       </w:r>
     </w:p>
     <w:p>
@@ -111,7 +191,7 @@
         <w:rPr>
           <w:color w:val="000000"/>
         </w:rPr>
-        <w:t>Para Melhem, ele estava sendo julgado em praça pública, antes de qualquer processo, sem chance real de se defender.</w:t>
+        <w:t>Na época, Schroeder era o diretor-geral da Globo. O homem no topo de toda a emissora.</w:t>
       </w:r>
     </w:p>
     <w:p>
@@ -119,7 +199,7 @@
         <w:rPr>
           <w:color w:val="000000"/>
         </w:rPr>
-        <w:t>Duas semanas depois, no dia vinte de dezembro, ele resolveu falar. Sentou diante do jornalista Roberto Cabrini, no Domingo Espetacular, da Record.</w:t>
+        <w:t>Dessa vez, a reação foi diferente. Schroeder determinou que o caso fosse apurado pela área de compliance, o setor que investiga denúncias internas dentro das grandes empresas.</w:t>
       </w:r>
     </w:p>
     <w:p>
@@ -127,7 +207,7 @@
         <w:rPr>
           <w:color w:val="000000"/>
         </w:rPr>
-        <w:t>Repare no lugar que ele escolheu. A Record, a principal concorrente da Globo. O homem que tinha passado dezessete anos dentro da maior emissora do país foi contar a sua versão no canal rival, num domingo à noite, em horário nobre.</w:t>
+        <w:t>Foi aí, segundo a reportagem, que a história mudou de tamanho.</w:t>
       </w:r>
     </w:p>
     <w:p>
@@ -135,7 +215,7 @@
         <w:rPr>
           <w:color w:val="000000"/>
         </w:rPr>
-        <w:t>Cabrini é conhecido por entrevistas duras, cara a cara, com perguntas que não dão espaço para fuga.</w:t>
+        <w:t>Durante a apuração, outras mulheres que tinham trabalhado no departamento de humor também procuraram a investigação.</w:t>
       </w:r>
     </w:p>
     <w:p>
@@ -143,7 +223,7 @@
         <w:rPr>
           <w:color w:val="000000"/>
         </w:rPr>
-        <w:t>Foi uma entrevista longa e tensa. Durante toda a conversa, ele repetiu mais de uma vez que era inocente.</w:t>
+        <w:t>Dani Calabresa não estava sozinha.</w:t>
       </w:r>
     </w:p>
     <w:p>
@@ -151,7 +231,7 @@
         <w:rPr>
           <w:color w:val="000000"/>
         </w:rPr>
-        <w:t>Melhem disse que a reportagem era falsa. Negou ter usado o cargo para pressionar qualquer mulher ou para trocar favores. Admitiu que tinha tido relacionamentos íntimos com colegas de trabalho, mas disse que nenhum deles tinha sido crime.</w:t>
+        <w:t>Algumas falavam de episódios de natureza sexual. Outras falavam de humilhações e de um ambiente de trabalho que, segundo elas, tinha se tornado insuportável.</w:t>
       </w:r>
     </w:p>
     <w:p>
@@ -159,7 +239,7 @@
         <w:rPr>
           <w:color w:val="000000"/>
         </w:rPr>
-        <w:t>Sobre a festa de dois mil e dezessete, foi direto. Disse que nunca agarrou Dani Calabresa. E questionou se aquela cena, do jeito que foi descrita, poderia mesmo ter acontecido.</w:t>
+        <w:t>Aqui é importante deixar uma coisa clara. Tudo isso eram relatos. Acusações feitas por essas mulheres, que Marcius Melhem sempre negou da forma como foram descritas. Nenhuma delas tinha passado por um tribunal.</w:t>
       </w:r>
     </w:p>
     <w:p>
@@ -167,7 +247,15 @@
         <w:rPr>
           <w:color w:val="000000"/>
         </w:rPr>
-        <w:t>Mas, quando o assunto foi o que exatamente aconteceu entre os dois naquela noite, ele parou. Disse que sobre aquilo só falaria na Justiça.</w:t>
+        <w:t>Dentro da Globo, a investigação seguia.</w:t>
+      </w:r>
+    </w:p>
+    <w:p>
+      <w:r>
+        <w:rPr>
+          <w:color w:val="C00000"/>
+        </w:rPr>
+        <w:t>Agora pense de novo naquele afastamento que todo mundo achou que era só por motivo de família. Segundo a cronologia que veio a público depois, a apuração interna corria justamente naquele mesmo período. Do lado de fora, o público via um pai cuidando da filha doente. Lá dentro, havia uma investigação com o nome dele.</w:t>
       </w:r>
     </w:p>
     <w:p>
@@ -175,7 +263,7 @@
         <w:rPr>
           <w:color w:val="000000"/>
         </w:rPr>
-        <w:t>Ele também levantou uma suspeita grave. Sugeriu que as acusações tinham a ver com uma briga profissional, uma disputa em torno de um programa em dois mil e dezenove.</w:t>
+        <w:t>Os meses foram passando.</w:t>
       </w:r>
     </w:p>
     <w:p>
@@ -183,7 +271,7 @@
         <w:rPr>
           <w:color w:val="000000"/>
         </w:rPr>
-        <w:t>Diante das câmeras, mostrou uma coisa.</w:t>
+        <w:t>No departamento de humor, segundo quem estava lá, o clima ficou pesado. Todo mundo sabia que alguma coisa estava acontecendo. Quase ninguém sabia exatamente o quê.</w:t>
       </w:r>
     </w:p>
     <w:p>
@@ -191,7 +279,7 @@
         <w:rPr>
           <w:color w:val="000000"/>
         </w:rPr>
-        <w:t>Mensagens.</w:t>
+        <w:t>Foi nesse período que um grupo de artistas decidiu se manifestar.</w:t>
       </w:r>
     </w:p>
     <w:p>
@@ -199,7 +287,7 @@
         <w:rPr>
           <w:color w:val="000000"/>
         </w:rPr>
-        <w:t>Conversas no celular, trocadas entre ele e Dani Calabresa depois da época dos fatos. Segundo Melhem, aquelas mensagens mostravam uma relação de amizade e intimidade, incompatível com a história que a revista tinha contado.</w:t>
+        <w:t>Segundo a reportagem, eles assinaram uma carta cobrando providências da emissora.</w:t>
       </w:r>
     </w:p>
     <w:p>
@@ -207,7 +295,7 @@
         <w:rPr>
           <w:color w:val="000000"/>
         </w:rPr>
-        <w:t>O raciocínio dele era simples. Se ela tivesse passado pelo que a revista descreveu, por que continuaria conversando com ele daquele jeito?</w:t>
+        <w:t>Um dos nomes naquela carta chamou atenção.</w:t>
       </w:r>
     </w:p>
     <w:p>
@@ -215,7 +303,87 @@
         <w:rPr>
           <w:color w:val="000000"/>
         </w:rPr>
-        <w:t>Era uma pergunta que muita gente repetiu nas redes. E era uma pergunta que muitas mulheres que já passaram por situações parecidas conheciam bem. Quem depende do chefe para continuar trabalhando nem sempre consegue se afastar dele.</w:t>
+        <w:t>Marcelo Adnet.</w:t>
+      </w:r>
+    </w:p>
+    <w:p>
+      <w:r>
+        <w:rPr>
+          <w:color w:val="000000"/>
+        </w:rPr>
+        <w:t>O parceiro do Tá no Ar. O homem que tinha dividido com Melhem as indicações ao Emmy Internacional e os textos escritos a quatro mãos.</w:t>
+      </w:r>
+    </w:p>
+    <w:p>
+      <w:r>
+        <w:rPr>
+          <w:color w:val="000000"/>
+        </w:rPr>
+        <w:t>Adnet ficou do lado das mulheres que denunciavam.</w:t>
+      </w:r>
+    </w:p>
+    <w:p>
+      <w:r>
+        <w:rPr>
+          <w:color w:val="000000"/>
+        </w:rPr>
+        <w:t>Só que existe um detalhe nessa história que muita gente esquece.</w:t>
+      </w:r>
+    </w:p>
+    <w:p>
+      <w:r>
+        <w:rPr>
+          <w:color w:val="000000"/>
+        </w:rPr>
+        <w:t>Marcelo Adnet e Dani Calabresa tinham sido casados.</w:t>
+      </w:r>
+    </w:p>
+    <w:p>
+      <w:r>
+        <w:rPr>
+          <w:color w:val="000000"/>
+        </w:rPr>
+        <w:t>Os dois oficializaram a união em dois mil e dez, depois de alguns anos juntos. Saíram juntos da MTV. Viraram um dos casais mais conhecidos do humor brasileiro.</w:t>
+      </w:r>
+    </w:p>
+    <w:p>
+      <w:r>
+        <w:rPr>
+          <w:color w:val="000000"/>
+        </w:rPr>
+        <w:t>Em dois mil e dezessete, anunciaram a separação, depois de uma crise que tinha ido parar nas páginas de fofoca anos antes.</w:t>
+      </w:r>
+    </w:p>
+    <w:p>
+      <w:r>
+        <w:rPr>
+          <w:color w:val="000000"/>
+        </w:rPr>
+        <w:t>Dois mil e dezessete. Guarde esse ano. Porque é o mesmo ano em que, segundo o relato que viria a público depois, teria acontecido um dos episódios mais graves que Dani diz ter vivido dentro do departamento de humor.</w:t>
+      </w:r>
+    </w:p>
+    <w:p>
+      <w:r>
+        <w:rPr>
+          <w:color w:val="000000"/>
+        </w:rPr>
+        <w:t>Mesmo depois da separação, os dois afirmaram em entrevistas que continuaram amigos.</w:t>
+      </w:r>
+    </w:p>
+    <w:p>
+      <w:r>
+        <w:rPr>
+          <w:color w:val="000000"/>
+        </w:rPr>
+        <w:t>Quando a acusação veio, o ex-marido ficou do lado dela.</w:t>
+      </w:r>
+    </w:p>
+    <w:p>
+      <w:r>
+        <w:rPr>
+          <w:color w:val="000000"/>
+        </w:rPr>
+        <w:t>Para quem acompanhava a dupla de longe, era difícil de acreditar. Os dois tinham sido, durante anos, a cara do humor mais inteligente da televisão aberta.</w:t>
       </w:r>
     </w:p>
     <w:p>
@@ -223,7 +391,7 @@
         <w:rPr>
           <w:color w:val="C00000"/>
         </w:rPr>
-        <w:t>Guarde essas mensagens. Porque elas viraram a principal arma da defesa dele. E, anos depois, foram justamente as palavras de Melhem sobre essas mulheres que acabaram gerando um novo processo contra ele.</w:t>
+        <w:t>E essa foi só a primeira vez. Porque, nos anos seguintes, Adnet ia voltar a falar sobre o caso em público, e cada palavra dele ia ser lida como um recado ao antigo parceiro. Uma amizade de anos tinha virado um dos lados de uma guerra.</w:t>
       </w:r>
     </w:p>
     <w:p>
@@ -231,7 +399,7 @@
         <w:rPr>
           <w:color w:val="000000"/>
         </w:rPr>
-        <w:t>Essa é a versão dele, contada por ele mesmo em rede nacional. Ele sempre negou as acusações, e nunca foi condenado por nenhuma delas.</w:t>
+        <w:t>Então veio agosto de dois mil e vinte.</w:t>
       </w:r>
     </w:p>
     <w:p>
@@ -239,7 +407,7 @@
         <w:rPr>
           <w:color w:val="000000"/>
         </w:rPr>
-        <w:t>Do outro lado, existe a versão que a piauí publicou, a partir do relato de Dani Calabresa e de testemunhas. Uma versão que os advogados das mulheres sustentaram na Justiça durante anos.</w:t>
+        <w:t>A Globo anunciou que o contrato de Melhem tinha terminado em comum acordo.</w:t>
       </w:r>
     </w:p>
     <w:p>
@@ -247,7 +415,7 @@
         <w:rPr>
           <w:color w:val="000000"/>
         </w:rPr>
-        <w:t>Esse relato foi reconstruído a partir de pessoas que estavam na festa. Gente que viu Dani logo depois daquela noite e contou à revista o que presenciou. Cada detalhe que você vai ouvir agora é atribuído à reportagem publicada naquele dezembro de dois mil e vinte, e todos foram negados por Melhem.</w:t>
+        <w:t>Dentro da emissora, muita gente não engoliu aquela versão.</w:t>
       </w:r>
     </w:p>
     <w:p>
@@ -255,7 +423,7 @@
         <w:rPr>
           <w:color w:val="000000"/>
         </w:rPr>
-        <w:t>A reportagem começava por aquela noite.</w:t>
+        <w:t>Segundo a reportagem, cerca de trinta profissionais da área de humor enviaram um e-mail a Schroeder. Na mensagem, questionavam a forma como o caso tinha sido encerrado.</w:t>
       </w:r>
     </w:p>
     <w:p>
@@ -263,7 +431,7 @@
         <w:rPr>
           <w:color w:val="000000"/>
         </w:rPr>
-        <w:t>A festa de confraternização do elenco do Zorra, em dois mil e dezessete.</w:t>
+        <w:t>Para eles, um comunicado de poucas linhas era pouco diante de tudo o que tinha sido relatado à investigação.</w:t>
       </w:r>
     </w:p>
     <w:p>
@@ -271,7 +439,223 @@
         <w:rPr>
           <w:color w:val="000000"/>
         </w:rPr>
-        <w:t>Lembre da porta do banheiro. É ali que tudo acontece.</w:t>
+        <w:t>As mulheres que tinham feito as denúncias queriam ver o resultado da apuração. Queriam saber o que o compliance tinha concluído sobre os relatos delas.</w:t>
+      </w:r>
+    </w:p>
+    <w:p>
+      <w:r>
+        <w:rPr>
+          <w:color w:val="000000"/>
+        </w:rPr>
+        <w:t>Elas procuraram uma advogada.</w:t>
+      </w:r>
+    </w:p>
+    <w:p>
+      <w:r>
+        <w:rPr>
+          <w:color w:val="000000"/>
+        </w:rPr>
+        <w:t>O nome dela era Mayra Cotta.</w:t>
+      </w:r>
+    </w:p>
+    <w:p>
+      <w:r>
+        <w:rPr>
+          <w:color w:val="C00000"/>
+        </w:rPr>
+        <w:t>Guarde esse nome também. Porque, poucos meses depois, essa advogada ia estar entre as pessoas que Marcius Melhem anunciou que ia levar à Justiça. E aquela disputa ia muito além de uma troca de notas na imprensa.</w:t>
+      </w:r>
+    </w:p>
+    <w:p>
+      <w:r>
+        <w:rPr>
+          <w:color w:val="000000"/>
+        </w:rPr>
+        <w:t>A Globo, por sua vez, manteve o resultado da investigação dentro de casa.</w:t>
+      </w:r>
+    </w:p>
+    <w:p>
+      <w:r>
+        <w:rPr>
+          <w:color w:val="000000"/>
+        </w:rPr>
+        <w:t>Marcius Melhem também ficou calado. Durante todos aqueles meses, ele não falou publicamente sobre o assunto. Mais tarde, ele mesmo contaria que levou cerca de um ano para decidir se manifestar.</w:t>
+      </w:r>
+    </w:p>
+    <w:p>
+      <w:r>
+        <w:rPr>
+          <w:color w:val="000000"/>
+        </w:rPr>
+        <w:t>Do lado de fora, o país seguia sem saber de nada.</w:t>
+      </w:r>
+    </w:p>
+    <w:p>
+      <w:r>
+        <w:rPr>
+          <w:color w:val="000000"/>
+        </w:rPr>
+        <w:t>Só que alguém, longe da emissora, tinha começado a fazer perguntas.</w:t>
+      </w:r>
+    </w:p>
+    <w:p>
+      <w:r>
+        <w:rPr>
+          <w:color w:val="000000"/>
+        </w:rPr>
+        <w:t>Um repórter passou a procurar pessoas que tinham trabalhado naquele departamento. Atores e roteiristas. Gente que estava nos corredores e nos estúdios durante os anos em que Melhem esteve no comando.</w:t>
+      </w:r>
+    </w:p>
+    <w:p>
+      <w:r>
+        <w:rPr>
+          <w:color w:val="000000"/>
+        </w:rPr>
+        <w:t>Uma por uma, essas pessoas foram ouvidas.</w:t>
+      </w:r>
+    </w:p>
+    <w:p>
+      <w:r>
+        <w:rPr>
+          <w:color w:val="000000"/>
+        </w:rPr>
+        <w:t>Algumas aceitaram falar com o nome. A maioria pediu para não ser identificada.</w:t>
+      </w:r>
+    </w:p>
+    <w:p>
+      <w:r>
+        <w:rPr>
+          <w:color w:val="000000"/>
+        </w:rPr>
+        <w:t>Existe uma pergunta que atravessa toda esta história, do começo ao fim.</w:t>
+      </w:r>
+    </w:p>
+    <w:p>
+      <w:r>
+        <w:rPr>
+          <w:color w:val="000000"/>
+        </w:rPr>
+        <w:t>Quando quem é acusado tem o poder de decidir o futuro de quem acusa, em quem as pessoas acreditam?</w:t>
+      </w:r>
+    </w:p>
+    <w:p>
+      <w:r>
+        <w:rPr>
+          <w:color w:val="000000"/>
+        </w:rPr>
+        <w:t>Pense em quem estava naquele departamento. Uma humorista em começo de carreira dependia de ser escalada. Um roteirista dependia de ter o texto aprovado. Falar significava arriscar tudo isso. Ficar calado significava continuar trabalhando.</w:t>
+      </w:r>
+    </w:p>
+    <w:p>
+      <w:r>
+        <w:rPr>
+          <w:color w:val="000000"/>
+        </w:rPr>
+        <w:t>Segundo os relatos que viriam a público, muita gente escolheu o silêncio por anos.</w:t>
+      </w:r>
+    </w:p>
+    <w:p>
+      <w:r>
+        <w:rPr>
+          <w:color w:val="000000"/>
+        </w:rPr>
+        <w:t>O humor da televisão brasileira é um mercado pequeno. Todo mundo se conhece de outros trabalhos, e as vagas na maior emissora do país são poucas. Ganhar fama de problemática podia fechar portas na Globo e também em qualquer outra emissora onde aquela pessoa tentasse trabalhar nos anos seguintes.</w:t>
+      </w:r>
+    </w:p>
+    <w:p>
+      <w:r>
+        <w:rPr>
+          <w:color w:val="000000"/>
+        </w:rPr>
+        <w:t>Foi nesse ambiente fechado que as denúncias tinham nascido.</w:t>
+      </w:r>
+    </w:p>
+    <w:p>
+      <w:r>
+        <w:rPr>
+          <w:color w:val="000000"/>
+        </w:rPr>
+        <w:t>Antes de chegar ao que foi publicado, vale entender duas expressões que iam aparecer em todas as manchetes.</w:t>
+      </w:r>
+    </w:p>
+    <w:p>
+      <w:r>
+        <w:rPr>
+          <w:color w:val="000000"/>
+        </w:rPr>
+        <w:t>Assédio sexual, pela lei brasileira, é crime. Acontece quando alguém usa a posição de chefe para constranger outra pessoa com o objetivo de obter vantagem ou favor de natureza sexual.</w:t>
+      </w:r>
+    </w:p>
+    <w:p>
+      <w:r>
+        <w:rPr>
+          <w:color w:val="000000"/>
+        </w:rPr>
+        <w:t>Já o assédio moral tem outro formato. São humilhações repetidas e um tratamento que torna o trabalho insuportável. Na Justiça, ele costuma ser discutido como uma questão trabalhista, sem um crime específico com esse nome no Código Penal.</w:t>
+      </w:r>
+    </w:p>
+    <w:p>
+      <w:r>
+        <w:rPr>
+          <w:color w:val="000000"/>
+        </w:rPr>
+        <w:t>Duas coisas diferentes, com consequências diferentes.</w:t>
+      </w:r>
+    </w:p>
+    <w:p>
+      <w:r>
+        <w:rPr>
+          <w:color w:val="000000"/>
+        </w:rPr>
+        <w:t>Guarde essa diferença, porque ela ia pesar muito em tudo o que aconteceu depois.</w:t>
+      </w:r>
+    </w:p>
+    <w:p>
+      <w:r>
+        <w:rPr>
+          <w:color w:val="C00000"/>
+        </w:rPr>
+        <w:t>Pense nessa cena por um instante. De um lado, um grupo de mulheres que dizia ter sofrido dentro da maior emissora do Brasil. Do outro, um diretor que tinha saído sem nenhuma explicação pública. E, no meio dos dois, um relatório que ninguém de fora tinha lido. Aquele silêncio não ia durar muito. Quando ele acabou, acabou da forma mais barulhenta possível.</w:t>
+      </w:r>
+    </w:p>
+    <w:p>
+      <w:r>
+        <w:rPr>
+          <w:color w:val="000000"/>
+        </w:rPr>
+        <w:t>Quatro de dezembro de dois mil e vinte.</w:t>
+      </w:r>
+    </w:p>
+    <w:p>
+      <w:r>
+        <w:rPr>
+          <w:color w:val="000000"/>
+        </w:rPr>
+        <w:t>Uma sexta-feira.</w:t>
+      </w:r>
+    </w:p>
+    <w:p>
+      <w:r>
+        <w:rPr>
+          <w:color w:val="000000"/>
+        </w:rPr>
+        <w:t>O país ainda vivia a pandemia. Muita gente estava em casa, com o celular na mão, acompanhando tudo pelas redes sociais.</w:t>
+      </w:r>
+    </w:p>
+    <w:p>
+      <w:r>
+        <w:rPr>
+          <w:color w:val="000000"/>
+        </w:rPr>
+        <w:t>Fazia menos de quatro meses que a Globo tinha anunciado a saída de Melhem com um comunicado de poucas linhas. Para o público, o assunto estava encerrado.</w:t>
+      </w:r>
+    </w:p>
+    <w:p>
+      <w:r>
+        <w:rPr>
+          <w:color w:val="000000"/>
+        </w:rPr>
+        <w:t>Naquela manhã, ele voltou com uma força que ninguém esperava.</w:t>
       </w:r>
     </w:p>
     <w:p>
@@ -279,7 +663,7 @@
         <w:rPr>
           <w:color w:val="1F4EB4"/>
         </w:rPr>
-        <w:t>Segundo a reportagem, Dani Calabresa estava saindo do banheiro quando Marcius Melhem a encurralou.</w:t>
+        <w:t>Naquele dia, a revista piauí publicou uma reportagem assinada pelo jornalista João Batista Júnior. O texto era resultado de quarenta e três entrevistas. E trazia relatos de mulheres que diziam ter sofrido assédio dentro do departamento de humor da Globo, entre dois mil e quinze e dois mil e dezenove. Justamente os anos em que Marcius Melhem comandava o Zorra.</w:t>
       </w:r>
     </w:p>
     <w:p>
@@ -287,159 +671,7 @@
         <w:rPr>
           <w:color w:val="1F4EB4"/>
         </w:rPr>
-        <w:t>A revista descreve que ele tentou beijá-la à força, usando força física para segurá-la. E que, naquele momento, ele colocou o pênis para fora da calça.</w:t>
-      </w:r>
-    </w:p>
-    <w:p>
-      <w:r>
-        <w:rPr>
-          <w:color w:val="1F4EB4"/>
-        </w:rPr>
-        <w:t>Dani saiu dali.</w:t>
-      </w:r>
-    </w:p>
-    <w:p>
-      <w:r>
-        <w:rPr>
-          <w:color w:val="1F4EB4"/>
-        </w:rPr>
-        <w:t>Do lado de fora, dois colegas do elenco a encontraram abalada. Os atores Luis Miranda e George Sauma. Segundo a revista, foram eles que a acolheram naquela noite.</w:t>
-      </w:r>
-    </w:p>
-    <w:p>
-      <w:r>
-        <w:rPr>
-          <w:color w:val="1F4EB4"/>
-        </w:rPr>
-        <w:t>Pense na cena. Uma festa cheia de colegas de trabalho. A poucos metros de todos eles, uma mulher saindo de perto da porta de um banheiro, abalada, sem saber o que fazer.</w:t>
-      </w:r>
-    </w:p>
-    <w:p>
-      <w:r>
-        <w:rPr>
-          <w:color w:val="1F4EB4"/>
-        </w:rPr>
-        <w:t>O homem envolvido naquela cena, segundo o relato, era o diretor do programa onde ela trabalhava.</w:t>
-      </w:r>
-    </w:p>
-    <w:p>
-      <w:r>
-        <w:rPr>
-          <w:color w:val="1F4EB4"/>
-        </w:rPr>
-        <w:t>Três dias depois, durante um ensaio do Zorra, segundo a reportagem, Melhem apareceu no estúdio para falar com ela.</w:t>
-      </w:r>
-    </w:p>
-    <w:p>
-      <w:r>
-        <w:rPr>
-          <w:color w:val="1F4EB4"/>
-        </w:rPr>
-        <w:t>Segundo o relato publicado, disse que não tinha culpa do que tinha acontecido. A culpa, nas palavras atribuídas a ele, era de Dani, por ela estar muito gostosa naquela noite.</w:t>
-      </w:r>
-    </w:p>
-    <w:p>
-      <w:r>
-        <w:rPr>
-          <w:color w:val="1F4EB4"/>
-        </w:rPr>
-        <w:t>A revista afirma que essa conversa também foi testemunhada por colegas.</w:t>
-      </w:r>
-    </w:p>
-    <w:p>
-      <w:r>
-        <w:rPr>
-          <w:color w:val="1F4EB4"/>
-        </w:rPr>
-        <w:t>A reportagem também fala em ameaças de boicote profissional contra ela.</w:t>
-      </w:r>
-    </w:p>
-    <w:p>
-      <w:r>
-        <w:rPr>
-          <w:color w:val="1F4EB4"/>
-        </w:rPr>
-        <w:t>Volte à cadeira de diretor. À sala onde se decidia quem ganhava espaço e quem ficava esperando.</w:t>
-      </w:r>
-    </w:p>
-    <w:p>
-      <w:r>
-        <w:rPr>
-          <w:color w:val="1F4EB4"/>
-        </w:rPr>
-        <w:t>Era esse homem que, segundo a reportagem, tinha nas mãos o futuro dela dentro da Globo.</w:t>
-      </w:r>
-    </w:p>
-    <w:p>
-      <w:r>
-        <w:rPr>
-          <w:color w:val="1F4EB4"/>
-        </w:rPr>
-        <w:t>Esse era o segredo dos bastidores do Zorra. O que a Globo não contou nas duas notas.</w:t>
-      </w:r>
-    </w:p>
-    <w:p>
-      <w:r>
-        <w:rPr>
-          <w:color w:val="1F4EB4"/>
-        </w:rPr>
-        <w:t>Mas a parte que mais revoltou quem leu aquela reportagem veio logo depois. Porque a piauí também contou o que a Globo fez quando Dani finalmente teve coragem de denunciar.</w:t>
-      </w:r>
-    </w:p>
-    <w:p>
-      <w:r>
-        <w:rPr>
-          <w:color w:val="1F4EB4"/>
-        </w:rPr>
-        <w:t>Volte à ligação de vinte e dois de dezembro, e à reunião marcada para dois de janeiro com Mônica Albuquerque.</w:t>
-      </w:r>
-    </w:p>
-    <w:p>
-      <w:r>
-        <w:rPr>
-          <w:color w:val="1F4EB4"/>
-        </w:rPr>
-        <w:t>Segundo a revista, a primeira decisão tomada depois da denúncia foi recomendar terapia ao acusado.</w:t>
-      </w:r>
-    </w:p>
-    <w:p>
-      <w:r>
-        <w:rPr>
-          <w:color w:val="1F4EB4"/>
-        </w:rPr>
-        <w:t>Terapia.</w:t>
-      </w:r>
-    </w:p>
-    <w:p>
-      <w:r>
-        <w:rPr>
-          <w:color w:val="1F4EB4"/>
-        </w:rPr>
-        <w:t>Sem nenhuma advertência.</w:t>
-      </w:r>
-    </w:p>
-    <w:p>
-      <w:r>
-        <w:rPr>
-          <w:color w:val="1F4EB4"/>
-        </w:rPr>
-        <w:t>Dani teve reuniões por vídeo com a emissora. Pediu para receber um relatório com o resultado da apuração. Segundo a reportagem, esse pedido não foi atendido.</w:t>
-      </w:r>
-    </w:p>
-    <w:p>
-      <w:r>
-        <w:rPr>
-          <w:color w:val="1F4EB4"/>
-        </w:rPr>
-        <w:t>Só mais tarde, segundo a piauí, o então diretor-geral da Globo, Carlos Henrique Schroder, mandou abrir uma investigação. E, durante essa investigação, outras três atrizes procuraram a empresa para contar situações parecidas.</w:t>
-      </w:r>
-    </w:p>
-    <w:p>
-      <w:r>
-        <w:rPr>
-          <w:color w:val="1F4EB4"/>
-        </w:rPr>
-        <w:t>O que aconteceu depois que essa história saiu na imprensa mostra até onde alguém estava disposto a ir para que ela parasse de ser contada.</w:t>
+        <w:t>Segundo a reportagem, as denúncias somavam doze casos. Em cinco deles, os relatos eram de assédio sexual, em alguns casos junto com assédio moral. Nos outros sete, as mulheres falavam de assédio moral. O nome mais conhecido entre elas era o de Dani Calabresa.</w:t>
       </w:r>
     </w:p>
     <w:p>
@@ -447,7 +679,7 @@
         <w:rPr>
           <w:color w:val="000000"/>
         </w:rPr>
-        <w:t>Segundo a reportagem, as três atrizes relataram desconforto em trabalhar com Melhem. E descreveram contatos de teor sexual que não tinham desejado, durante cenas e gravações.</w:t>
+        <w:t>O Brasil parou para ler.</w:t>
       </w:r>
     </w:p>
     <w:p>
@@ -455,7 +687,55 @@
         <w:rPr>
           <w:color w:val="000000"/>
         </w:rPr>
-        <w:t>A revista também falava em mensagens de conteúdo sexual enviadas repetidamente a mulheres da equipe.</w:t>
+        <w:t>Segundo o relato de Dani à revista, um dos episódios teria acontecido em dois mil e dezessete, durante uma confraternização do elenco. Ela contou que o diretor teria feito investidas que ela não queria, e que ela recusou.</w:t>
+      </w:r>
+    </w:p>
+    <w:p>
+      <w:r>
+        <w:rPr>
+          <w:color w:val="000000"/>
+        </w:rPr>
+        <w:t>De acordo com Dani, depois disso, o tratamento mudou.</w:t>
+      </w:r>
+    </w:p>
+    <w:p>
+      <w:r>
+        <w:rPr>
+          <w:color w:val="000000"/>
+        </w:rPr>
+        <w:t>Ela relatou comentários de desprezo durante gravações, na frente de colegas. E afirmou que passou a sentir que a carreira dela estava sendo travada pelo homem que comandava o departamento.</w:t>
+      </w:r>
+    </w:p>
+    <w:p>
+      <w:r>
+        <w:rPr>
+          <w:color w:val="000000"/>
+        </w:rPr>
+        <w:t>A reportagem citava ainda um áudio. Segundo a revista, era uma gravação em que Melhem teria feito piada sobre ela.</w:t>
+      </w:r>
+    </w:p>
+    <w:p>
+      <w:r>
+        <w:rPr>
+          <w:color w:val="000000"/>
+        </w:rPr>
+        <w:t>As outras mulheres, a maioria sem revelar o nome, contavam histórias parecidas. Relatos de medo. De gente que dizia ter evitado ficar sozinha numa sala com o chefe. De quem preferiu se calar para não perder o emprego.</w:t>
+      </w:r>
+    </w:p>
+    <w:p>
+      <w:r>
+        <w:rPr>
+          <w:color w:val="000000"/>
+        </w:rPr>
+        <w:t>Todas essas acusações, vale repetir, eram a versão de quem acusava.</w:t>
+      </w:r>
+    </w:p>
+    <w:p>
+      <w:r>
+        <w:rPr>
+          <w:color w:val="000000"/>
+        </w:rPr>
+        <w:t>Marcius Melhem tinha a dele.</w:t>
       </w:r>
     </w:p>
     <w:p>
@@ -463,7 +743,7 @@
         <w:rPr>
           <w:color w:val="C00000"/>
         </w:rPr>
-        <w:t>Repare como a história muda de tamanho aqui. Até então, era uma denúncia de uma humorista contra o chefe. Agora eram várias mulheres, uma empresa acusada de demorar a agir e um diretor que negava tudo diante das câmeras.</w:t>
+        <w:t>Só que a resposta que ele deu nos dias seguintes surpreendeu até quem esperava uma negativa simples. Porque, ao mesmo tempo em que negava as acusações, ele fez uma confissão que ninguém esperava ouvir.</w:t>
       </w:r>
     </w:p>
     <w:p>
@@ -471,7 +751,7 @@
         <w:rPr>
           <w:color w:val="000000"/>
         </w:rPr>
-        <w:t>Depois da reportagem, a Globo anunciou mudanças na área que cuidava dos artistas. E Mônica Albuquerque, a executiva que tinha recebido aquela primeira ligação, deixou a emissora. Segundo a Globo, a pedido dela.</w:t>
+        <w:t>Melhem tinha recusado dar entrevista à revista.</w:t>
       </w:r>
     </w:p>
     <w:p>
@@ -479,7 +759,7 @@
         <w:rPr>
           <w:color w:val="000000"/>
         </w:rPr>
-        <w:t>Enquanto isso, o caso já estava sendo investigado pelas autoridades do Rio de Janeiro. O inquérito ia crescendo, com depoimentos e documentos.</w:t>
+        <w:t>Depois da publicação, divulgou uma nota. Disse que estava sendo julgado em praça pública antes de qualquer processo. Disse que, se tivesse causado algum mal a alguém, estava disposto a assumir a responsabilidade. E pediu transparência sobre o que de fato tinha sido apurado.</w:t>
       </w:r>
     </w:p>
     <w:p>
@@ -487,7 +767,7 @@
         <w:rPr>
           <w:color w:val="000000"/>
         </w:rPr>
-        <w:t>Lembre das duas mil e quatrocentas páginas.</w:t>
+        <w:t>Ele negou ter cometido assédio.</w:t>
       </w:r>
     </w:p>
     <w:p>
@@ -495,7 +775,7 @@
         <w:rPr>
           <w:color w:val="000000"/>
         </w:rPr>
-        <w:t>Elas estavam sendo escritas naquele momento.</w:t>
+        <w:t>Anunciou também que ia processar Dani Calabresa e a advogada Mayra Cotta.</w:t>
       </w:r>
     </w:p>
     <w:p>
@@ -503,7 +783,7 @@
         <w:rPr>
           <w:color w:val="000000"/>
         </w:rPr>
-        <w:t>Dani Calabresa, enquanto o Brasil inteiro discutia a vida dela, ficou em silêncio.</w:t>
+        <w:t>No dia seguinte, Melhem deu uma entrevista ao portal UOL.</w:t>
       </w:r>
     </w:p>
     <w:p>
@@ -511,7 +791,79 @@
         <w:rPr>
           <w:color w:val="000000"/>
         </w:rPr>
-        <w:t>Durante semanas, ela não deu entrevistas sobre o caso. As versões circulavam, a dele na televisão e a dela nas páginas da revista, mas a voz de Dani quase não aparecia.</w:t>
+        <w:t>Contou que tinha levado um ano para falar. E que tinha chegado à conclusão de que muito do que estava acontecendo com ele era consequência dos próprios erros.</w:t>
+      </w:r>
+    </w:p>
+    <w:p>
+      <w:r>
+        <w:rPr>
+          <w:color w:val="000000"/>
+        </w:rPr>
+        <w:t>Então descreveu a si mesmo de um jeito que pouca gente imaginava ouvir. Disse que tinha sido um homem tóxico, e um marido péssimo. Admitiu que tinha exagerado ao se relacionar com pessoas do próprio ambiente de trabalho.</w:t>
+      </w:r>
+    </w:p>
+    <w:p>
+      <w:r>
+        <w:rPr>
+          <w:color w:val="000000"/>
+        </w:rPr>
+        <w:t>Só que, na mesma entrevista, traçou um limite. Afirmou que jamais teve uma relação que não fosse consensual. E disse que muita coisa dita contra ele era mentira, e que ia combater cada uma dessas acusações.</w:t>
+      </w:r>
+    </w:p>
+    <w:p>
+      <w:r>
+        <w:rPr>
+          <w:color w:val="000000"/>
+        </w:rPr>
+        <w:t>Sobre Dani, disse que tinha respeito por ela. E que era importante que os dois levassem o caso à Justiça.</w:t>
+      </w:r>
+    </w:p>
+    <w:p>
+      <w:r>
+        <w:rPr>
+          <w:color w:val="000000"/>
+        </w:rPr>
+        <w:t>Faltava a Globo falar.</w:t>
+      </w:r>
+    </w:p>
+    <w:p>
+      <w:r>
+        <w:rPr>
+          <w:color w:val="000000"/>
+        </w:rPr>
+        <w:t>Oito de dezembro de dois mil e vinte.</w:t>
+      </w:r>
+    </w:p>
+    <w:p>
+      <w:r>
+        <w:rPr>
+          <w:color w:val="000000"/>
+        </w:rPr>
+        <w:t>No Jornal Nacional, o telejornal mais assistido do país, a emissora leu uma nota sobre o caso.</w:t>
+      </w:r>
+    </w:p>
+    <w:p>
+      <w:r>
+        <w:rPr>
+          <w:color w:val="000000"/>
+        </w:rPr>
+        <w:t>Segundo a nota, as denúncias tinham sido apuradas pela área de compliance, e o processo estava protegido por regras de confidencialidade.</w:t>
+      </w:r>
+    </w:p>
+    <w:p>
+      <w:r>
+        <w:rPr>
+          <w:color w:val="000000"/>
+        </w:rPr>
+        <w:t>Então veio a frase que, para muita gente, resumia tudo. As razões da saída de Marcius Melhem não seriam tornadas públicas.</w:t>
+      </w:r>
+    </w:p>
+    <w:p>
+      <w:r>
+        <w:rPr>
+          <w:color w:val="000000"/>
+        </w:rPr>
+        <w:t>Dezessete anos de casa, doze casos relatados e quarenta e três entrevistas. E a resposta oficial da maior emissora do país era que o motivo continuaria em segredo.</w:t>
       </w:r>
     </w:p>
     <w:p>
@@ -519,7 +871,7 @@
         <w:rPr>
           <w:color w:val="C00000"/>
         </w:rPr>
-        <w:t>Só que a revista piauí ainda não tinha terminado. O repórter continuava ouvindo mulheres. E quando uma segunda reportagem estava pronta para sair, aconteceu uma coisa que quase nunca acontece no Brasil. Uma juíza proibiu a revista de publicar.</w:t>
+        <w:t>E foi aí que a história virou uma guerra. Porque, poucos meses depois, Melhem ia apresentar mensagens antigas de celular trocadas com Dani Calabresa. Mensagens que, segundo ele, contavam uma história completamente diferente da que o Brasil tinha acabado de ler. E o que estava escrito nelas ia dividir o país ao meio.</w:t>
       </w:r>
     </w:p>
     <w:sectPr>

</xml_diff>